<commit_message>
Fix scanner scope noise and report formatting
</commit_message>
<xml_diff>
--- a/docs/SecureScan-Complete-Guide.docx
+++ b/docs/SecureScan-Complete-Guide.docx
@@ -935,7 +935,7 @@
     </w:p>
     <w:p>
       <w:r>
-        <w:t>High findings should be triaged first. Likely findings should be reviewed against real data flow, framework protections, and runtime configuration before remediation is planned. Findings under generated, vendored, backup, or agent-worktree folders should be separated from application-owned code before making engineering decisions.</w:t>
+        <w:t>High findings should be triaged first. Likely findings should be reviewed against real data flow, framework protections, and runtime configuration before remediation is planned. SecureScan excludes common generated and agent-worktree metadata directories such as `.claude`, `.agents`, `.codex`, `node_modules`, build output, and dependency caches by default; findings in remaining backup or vendored folders should still be separated from application-owned code before making engineering decisions.</w:t>
       </w:r>
     </w:p>
     <w:p>
@@ -2046,7 +2046,7 @@
         <w:pStyle w:val="ListNumber"/>
       </w:pPr>
       <w:r>
-        <w:t>Separate owned application code findings from generated, vendored, backup, or worktree findings.</w:t>
+        <w:t>Separate owned application code findings from backup or vendored findings that are still in scope.</w:t>
       </w:r>
     </w:p>
     <w:p>
@@ -2100,14 +2100,14 @@
           <w:rFonts w:ascii="Courier New" w:hAnsi="Courier New"/>
           <w:sz w:val="18"/>
         </w:rPr>
-        <w:t>Findings: 93 total (Critical 0, High 9, Medium 68, Low 16)</w:t>
+        <w:t>Findings: 6 total (Critical 0, High 3, Medium 1, Low 2)</w:t>
         <w:br/>
-        <w:t>Coverage: 100.0% (2635 scanned, 0 skipped)</w:t>
+        <w:t>Coverage: 100.0% (737 scanned, 0 skipped)</w:t>
       </w:r>
     </w:p>
     <w:p>
       <w:r>
-        <w:t>means SecureScan inspected all files it considered in scope and produced 93 static findings. It does not automatically mean all 93 are application-owned production issues. Review paths carefully. Findings under `.claude/worktrees`, generated folders, vendored dependencies, backups, or tool caches may need to be filtered out before prioritizing application remediation.</w:t>
+        <w:t>means SecureScan inspected all files it considered in scope and produced six static findings. It does not automatically mean every finding is an application-owned production issue. Review paths carefully. SecureScan excludes common generated and agent-worktree metadata directories by default, but backup folders, vendored source, or unusual tool caches may still need to be filtered out before prioritizing application remediation.</w:t>
       </w:r>
     </w:p>
     <w:p>

</xml_diff>